<commit_message>
Atualiza contrato: vigência indeterminada, notificações, legislação e taxas
- Vigência por prazo indeterminado com início em março/2026 e efeitos
  retroativos, sem termo final
- Reajuste anual ancorado no início da vigência
- Objeto ampliado: controle e resposta a notificações dos órgãos
  ambientais e acompanhamento das legislações ambientais
- Cláusula de exclusões passa a abranger expressamente todas as taxas
  necessárias aos licenciamentos

Co-Authored-By: Claude Fable 5 <noreply@anthropic.com>
Claude-Session: https://claude.ai/code/session_019HbFhJ7feXCBdU8ehmiNrq
</commit_message>
<xml_diff>
--- a/contrato-prestacao-de-servicos-biogenese-magalu.docx
+++ b/contrato-prestacao-de-servicos-biogenese-magalu.docx
@@ -195,7 +195,27 @@
         <w:jc w:val="both"/>
       </w:pPr>
       <w:r>
-        <w:t xml:space="preserve">c) responsabilidade técnica (RT) pela atualização anual dos Planos de Gerenciamento de Resíduos Sólidos (PGRS) das unidades da CONTRATANTE, nos termos da Lei Federal nº 12.305/2010, seus regulamentos e demais normas federais, estaduais e municipais aplicáveis.</w:t>
+        <w:t xml:space="preserve">c) responsabilidade técnica (RT) pela atualização anual dos Planos de Gerenciamento de Resíduos Sólidos (PGRS) das unidades da CONTRATANTE, nos termos da Lei Federal nº 12.305/2010, seus regulamentos e demais normas federais, estaduais e municipais aplicáveis;</w:t>
+      </w:r>
+    </w:p>
+    <w:p>
+      <w:pPr>
+        <w:spacing w:after="120" w:line="300"/>
+        <w:ind w:left="567"/>
+        <w:jc w:val="both"/>
+      </w:pPr>
+      <w:r>
+        <w:t xml:space="preserve">d) controle, gestão e resposta a notificações, ofícios e demais comunicações expedidas pelos órgãos ambientais e entidades fiscalizadoras em relação às unidades da CONTRATANTE, compreendendo a análise técnica, a elaboração e o protocolo das respostas cabíveis e o acompanhamento dos respectivos prazos;</w:t>
+      </w:r>
+    </w:p>
+    <w:p>
+      <w:pPr>
+        <w:spacing w:after="120" w:line="300"/>
+        <w:ind w:left="567"/>
+        <w:jc w:val="both"/>
+      </w:pPr>
+      <w:r>
+        <w:t xml:space="preserve">e) acompanhamento permanente da legislação ambiental federal, estadual e municipal aplicável às atividades das unidades da CONTRATANTE, mantendo-a atualizada quanto às alterações relevantes e às providências necessárias à sua adequação.</w:t>
       </w:r>
     </w:p>
     <w:p>
@@ -477,7 +497,7 @@
         <w:jc w:val="both"/>
       </w:pPr>
       <w:r>
-        <w:t xml:space="preserve">5.3. Os honorários serão reajustados a cada 12 (doze) meses, contados da data de assinatura deste Contrato, pela variação acumulada do IPCA/IBGE ou, na sua falta, do índice oficial que vier a substituí-lo.</w:t>
+        <w:t xml:space="preserve">5.3. Os honorários serão ajustados e corrigidos anualmente, a cada 12 (doze) meses contados do início da vigência previsto no item 7.1, pela variação acumulada do IPCA/IBGE ou, na sua falta, do índice oficial que vier a substituí-lo.</w:t>
       </w:r>
     </w:p>
     <w:p>
@@ -499,25 +519,54 @@
           <w:b/>
           <w:bCs/>
         </w:rPr>
-        <w:t xml:space="preserve">CLÁUSULA SEXTA – DAS DESPESAS NÃO INCLUÍDAS</w:t>
-      </w:r>
-    </w:p>
-    <w:p>
-      <w:pPr>
-        <w:spacing w:after="120" w:line="300"/>
-        <w:jc w:val="both"/>
-      </w:pPr>
-      <w:r>
-        <w:t xml:space="preserve">6.1. Não estão incluídos nos honorários previstos na Cláusula Quinta os valores correspondentes a deslocamentos às unidades da CONTRATANTE, passagens aéreas, hospedagem e alimentação em viagem, os quais serão pagos por demanda, conforme a necessidade de cada atividade.</w:t>
-      </w:r>
-    </w:p>
-    <w:p>
-      <w:pPr>
-        <w:spacing w:after="120" w:line="300"/>
-        <w:jc w:val="both"/>
-      </w:pPr>
-      <w:r>
-        <w:t xml:space="preserve">6.2. As despesas referidas no item 6.1 serão previamente estimadas pela CONTRATADA e aprovadas pela CONTRATANTE, sendo pagas ou reembolsadas mediante a apresentação dos respectivos comprovantes, juntamente com o faturamento do mês em que forem incorridas.</w:t>
+        <w:t xml:space="preserve">CLÁUSULA SEXTA – DAS DESPESAS E TAXAS NÃO INCLUÍDAS</w:t>
+      </w:r>
+    </w:p>
+    <w:p>
+      <w:pPr>
+        <w:spacing w:after="120" w:line="300"/>
+        <w:jc w:val="both"/>
+      </w:pPr>
+      <w:r>
+        <w:t xml:space="preserve">6.1. Não estão incluídos nos honorários previstos na Cláusula Quinta:</w:t>
+      </w:r>
+    </w:p>
+    <w:p>
+      <w:pPr>
+        <w:spacing w:after="120" w:line="300"/>
+        <w:ind w:left="567"/>
+        <w:jc w:val="both"/>
+      </w:pPr>
+      <w:r>
+        <w:t xml:space="preserve">a) os valores correspondentes a deslocamentos às unidades da CONTRATANTE, passagens aéreas, hospedagem e alimentação em viagem, os quais serão pagos por demanda, conforme a necessidade de cada atividade;</w:t>
+      </w:r>
+    </w:p>
+    <w:p>
+      <w:pPr>
+        <w:spacing w:after="120" w:line="300"/>
+        <w:ind w:left="567"/>
+        <w:jc w:val="both"/>
+      </w:pPr>
+      <w:r>
+        <w:t xml:space="preserve">b) quaisquer taxas, emolumentos, tarifas e preços públicos necessários aos licenciamentos e demais serviços objeto deste Contrato, exigidos por órgãos ambientais e demais entidades públicas ou privadas, incluindo, sem se limitar a, taxas de análise e de expedição de licenças, taxas de publicação e taxas de emissão de ART.</w:t>
+      </w:r>
+    </w:p>
+    <w:p>
+      <w:pPr>
+        <w:spacing w:after="120" w:line="300"/>
+        <w:jc w:val="both"/>
+      </w:pPr>
+      <w:r>
+        <w:t xml:space="preserve">6.2. As despesas referidas na alínea “a” do item 6.1 serão previamente estimadas pela CONTRATADA e aprovadas pela CONTRATANTE, sendo pagas ou reembolsadas mediante a apresentação dos respectivos comprovantes, juntamente com o faturamento do mês em que forem incorridas.</w:t>
+      </w:r>
+    </w:p>
+    <w:p>
+      <w:pPr>
+        <w:spacing w:after="120" w:line="300"/>
+        <w:jc w:val="both"/>
+      </w:pPr>
+      <w:r>
+        <w:t xml:space="preserve">6.3. Os valores referidos na alínea “b” do item 6.1 serão pagos diretamente pela CONTRATANTE ou, quando antecipados pela CONTRATADA mediante prévia autorização, reembolsados contra a apresentação dos respectivos comprovantes.</w:t>
       </w:r>
     </w:p>
     <w:p>
@@ -539,7 +588,17 @@
         <w:jc w:val="both"/>
       </w:pPr>
       <w:r>
-        <w:t xml:space="preserve">7.1. O presente Contrato vigorará pelo prazo de 12 (doze) meses, contados da data de sua assinatura, renovando-se automaticamente por períodos iguais e sucessivos, salvo manifestação em contrário de qualquer das partes, por escrito, com antecedência mínima de 30 (trinta) dias do término do prazo em curso.</w:t>
+        <w:t xml:space="preserve">7.1. O presente Contrato vigorará por prazo indeterminado, com início em </w:t>
+      </w:r>
+      <w:r>
+        <w:rPr>
+          <w:highlight w:val="yellow"/>
+          <w:highlightCs w:val="yellow"/>
+        </w:rPr>
+        <w:t xml:space="preserve">[1º]</w:t>
+      </w:r>
+      <w:r>
+        <w:t xml:space="preserve"> de março de 2026, reconhecendo as partes que os efeitos deste instrumento retroagem a essa data, independentemente da data de sua assinatura, ficando ratificados os serviços prestados e os atos praticados desde então.</w:t>
       </w:r>
     </w:p>
     <w:p>

</xml_diff>

<commit_message>
Substitui reajuste por IPCA por revisão anual mediante negociação
O item 5.3 passa a prever revisão anual dos honorários apenas por
acordo escrito entre as partes, sem reajuste automático por índice,
mantendo-se o valor vigente enquanto não houver novo acordo. Remove
a correção monetária indexada do item 5.4.

Co-Authored-By: Claude Fable 5 <noreply@anthropic.com>
Claude-Session: https://claude.ai/code/session_019HbFhJ7feXCBdU8ehmiNrq
</commit_message>
<xml_diff>
--- a/contrato-prestacao-de-servicos-biogenese-magalu.docx
+++ b/contrato-prestacao-de-servicos-biogenese-magalu.docx
@@ -497,16 +497,25 @@
         <w:jc w:val="both"/>
       </w:pPr>
       <w:r>
-        <w:t xml:space="preserve">5.3. Os honorários serão ajustados e corrigidos anualmente, a cada 12 (doze) meses contados do início da vigência previsto no item 7.1, pela variação acumulada do IPCA/IBGE ou, na sua falta, do índice oficial que vier a substituí-lo.</w:t>
-      </w:r>
-    </w:p>
-    <w:p>
-      <w:pPr>
-        <w:spacing w:after="120" w:line="300"/>
-        <w:jc w:val="both"/>
-      </w:pPr>
-      <w:r>
-        <w:t xml:space="preserve">5.4. Em caso de atraso no pagamento, incidirão multa moratória de 2% (dois por cento) sobre o valor devido, juros de mora de 1% (um por cento) ao mês, calculados pro rata die, e correção monetária pelo índice previsto no item 5.3.</w:t>
+        <w:t xml:space="preserve">5.3. Os honorários não estarão sujeitos a reajuste automático por índice de correção. Serão revistos anualmente, a cada 12 (doze) meses contados do início da vigência previsto no item 7.1, mediante negociação entre as partes, e somente serão alterados por acordo entre elas, formalizado por escrito.</w:t>
+      </w:r>
+    </w:p>
+    <w:p>
+      <w:pPr>
+        <w:spacing w:after="120" w:line="300"/>
+        <w:jc w:val="both"/>
+      </w:pPr>
+      <w:r>
+        <w:t xml:space="preserve">5.3.1. Enquanto não houver acordo quanto a novo valor, permanecerão vigentes os honorários então praticados.</w:t>
+      </w:r>
+    </w:p>
+    <w:p>
+      <w:pPr>
+        <w:spacing w:after="120" w:line="300"/>
+        <w:jc w:val="both"/>
+      </w:pPr>
+      <w:r>
+        <w:t xml:space="preserve">5.4. Em caso de atraso no pagamento, incidirão sobre o valor devido multa moratória de 2% (dois por cento) e juros de mora de 1% (um por cento) ao mês, calculados pro rata die.</w:t>
       </w:r>
     </w:p>
     <w:p>

</xml_diff>